<commit_message>
Expanded README with clearer program description
</commit_message>
<xml_diff>
--- a/README.docx
+++ b/README.docx
@@ -4,10 +4,7 @@
   <w:body>
     <w:p>
       <w:r>
-        <w:t>Name: Tamim Mubarak</w:t>
-      </w:r>
-      <w:r>
-        <w:t xml:space="preserve"> </w:t>
+        <w:t xml:space="preserve">Name: Tamim Mubarak </w:t>
       </w:r>
       <w:proofErr w:type="spellStart"/>
       <w:r>
@@ -72,6 +69,9 @@
       <w:r>
         <w:t>This project is a Music Playlist Analyzer developed using Python. The program allows the user to load, manage, and analyse a playlist of songs stored in a CSV file.</w:t>
       </w:r>
+      <w:r>
+        <w:t xml:space="preserve"> The program was designed to analyse a mixed playlist and present the results in a simple and user-friendly way.</w:t>
+      </w:r>
     </w:p>
     <w:p>
       <w:r>
@@ -97,22 +97,6 @@
     <w:p/>
     <w:p/>
     <w:p/>
-    <w:p>
-      <w:pPr>
-        <w:rPr>
-          <w:b/>
-          <w:bCs/>
-        </w:rPr>
-      </w:pPr>
-    </w:p>
-    <w:p>
-      <w:pPr>
-        <w:rPr>
-          <w:b/>
-          <w:bCs/>
-        </w:rPr>
-      </w:pPr>
-    </w:p>
     <w:p>
       <w:pPr>
         <w:rPr>
@@ -313,6 +297,15 @@
     <w:p/>
     <w:p>
       <w:r>
+        <w:t xml:space="preserve">5. </w:t>
+      </w:r>
+      <w:r>
+        <w:t>When exiting the program, any new songs added by the user are saved back to the CSV file.</w:t>
+      </w:r>
+    </w:p>
+    <w:p/>
+    <w:p>
+      <w:r>
         <w:t>_________________________________________________________________________________</w:t>
       </w:r>
     </w:p>
@@ -378,22 +371,6 @@
       </w:r>
     </w:p>
     <w:p/>
-    <w:p>
-      <w:pPr>
-        <w:rPr>
-          <w:b/>
-          <w:bCs/>
-        </w:rPr>
-      </w:pPr>
-    </w:p>
-    <w:p>
-      <w:pPr>
-        <w:rPr>
-          <w:b/>
-          <w:bCs/>
-        </w:rPr>
-      </w:pPr>
-    </w:p>
     <w:p>
       <w:pPr>
         <w:rPr>

</xml_diff>